<commit_message>
Clone Sequence - SUCCESS!!!
HIP HIP HURRAY :)
</commit_message>
<xml_diff>
--- a/ASW_Phase_1.docx
+++ b/ASW_Phase_1.docx
@@ -222,13 +222,9 @@
         <w:t xml:space="preserve"> Column in the above screenshot.</w:t>
       </w:r>
     </w:p>
-    <w:p/>
-    <w:p/>
-    <w:p/>
-    <w:p/>
-    <w:p/>
-    <w:p>
-      <w:r>
+    <w:p>
+      <w:r>
+        <w:lastRenderedPageBreak/>
         <w:t xml:space="preserve">Benny test </w:t>
       </w:r>
       <w:proofErr w:type="spellStart"/>
@@ -237,10 +233,30 @@
       </w:r>
       <w:proofErr w:type="spellEnd"/>
       <w:r>
-        <w:t xml:space="preserve"> sheirish</w:t>
-      </w:r>
+        <w:t xml:space="preserve"> </w:t>
+      </w:r>
+      <w:proofErr w:type="spellStart"/>
+      <w:r>
+        <w:t>sheirish</w:t>
+      </w:r>
+      <w:proofErr w:type="spellEnd"/>
+    </w:p>
+    <w:p>
       <w:bookmarkStart w:id="0" w:name="_GoBack"/>
       <w:bookmarkEnd w:id="0"/>
+    </w:p>
+    <w:p>
+      <w:r>
+        <w:t>Testing clone sequence</w:t>
+      </w:r>
+      <w:proofErr w:type="gramStart"/>
+      <w:r>
+        <w:t>…  /</w:t>
+      </w:r>
+      <w:proofErr w:type="gramEnd"/>
+      <w:r>
+        <w:t>*Benny</w:t>
+      </w:r>
     </w:p>
     <w:sectPr>
       <w:pgSz w:w="11906" w:h="16838"/>

</xml_diff>